<commit_message>
Add Phase II, remediation, and reclamation verticals with render optimizations.
Extend profiles, narratives, checklists, samples, and E2E scripts for Phase II ESA, groundwater, Phase III remediation, and reclamation certificates; reduce duplicate Excel/template work on preflight and batch render.

Co-authored-by: Cursor <cursoragent@cursor.com>
</commit_message>
<xml_diff>
--- a/samples/groundwater_monitoring_template.docx
+++ b/samples/groundwater_monitoring_template.docx
@@ -553,6 +553,11 @@
     </w:p>
     <w:p>
       <w:r>
+        <w:t>{{ gw_trend_summary }}</w:t>
+      </w:r>
+    </w:p>
+    <w:p>
+      <w:r>
         <w:t>{{ gw_recommendations }}</w:t>
       </w:r>
     </w:p>

</xml_diff>